<commit_message>
docs: update ShifaScribe_Week3_Report.docx with latest live API performance figures
</commit_message>
<xml_diff>
--- a/ShifaScribe_Week1_Report.docx
+++ b/ShifaScribe_Week1_Report.docx
@@ -304,23 +304,7 @@
                 <w:color w:val="1E293B"/>
                 <w:sz w:val="21"/>
               </w:rPr>
-              <w:t>July 27</w:t>
-            </w:r>
-            <w:r>
-              <w:rPr>
-                <w:rFonts w:ascii="Calibri" w:hAnsi="Calibri"/>
-                <w:color w:val="1E293B"/>
-                <w:sz w:val="21"/>
-              </w:rPr>
-              <w:t>, 2026</w:t>
-            </w:r>
-            <w:r>
-              <w:rPr>
-                <w:rFonts w:ascii="Calibri" w:hAnsi="Calibri"/>
-                <w:color w:val="1E293B"/>
-                <w:sz w:val="21"/>
-              </w:rPr>
-              <w:t xml:space="preserve"> – July 31, 2026</w:t>
+              <w:t>July 27, 2026 – July 31, 2026</w:t>
             </w:r>
           </w:p>
         </w:tc>
@@ -1526,17 +1510,6 @@
     <w:p>
       <w:pPr>
         <w:spacing w:before="360" w:after="160"/>
-        <w:rPr>
-          <w:rFonts w:ascii="Calibri" w:hAnsi="Calibri"/>
-          <w:b/>
-          <w:color w:val="0F172A"/>
-          <w:sz w:val="36"/>
-        </w:rPr>
-      </w:pPr>
-    </w:p>
-    <w:p>
-      <w:pPr>
-        <w:spacing w:before="360" w:after="160"/>
       </w:pPr>
       <w:r>
         <w:rPr>
@@ -1619,34 +1592,6 @@
               <w:rPr>
                 <w:b/>
               </w:rPr>
-              <w:t>Overall Week 1 Rating:</w:t>
-            </w:r>
-          </w:p>
-        </w:tc>
-        <w:tc>
-          <w:tcPr>
-            <w:tcW w:w="5904" w:type="dxa"/>
-          </w:tcPr>
-          <w:p>
-            <w:r>
-              <w:t>[   ] Excellent    [   ] Very Good    [   ] Satisfactory    [   ] Needs Revision</w:t>
-            </w:r>
-          </w:p>
-        </w:tc>
-      </w:tr>
-      <w:tr>
-        <w:trPr>
-          <w:jc w:val="center"/>
-        </w:trPr>
-        <w:tc>
-          <w:tcPr>
-            <w:tcW w:w="3168" w:type="dxa"/>
-          </w:tcPr>
-          <w:p>
-            <w:r>
-              <w:rPr>
-                <w:b/>
-              </w:rPr>
               <w:t>Supervisor Remarks &amp; Feedback:</w:t>
             </w:r>
           </w:p>
@@ -1658,41 +1603,16 @@
           <w:p>
             <w:pPr>
               <w:spacing w:after="800"/>
+              <w:rPr>
+                <w:color w:val="000000" w:themeColor="text1"/>
+              </w:rPr>
             </w:pPr>
             <w:r>
               <w:rPr>
                 <w:i/>
-                <w:color w:val="64748B"/>
+                <w:color w:val="000000" w:themeColor="text1"/>
               </w:rPr>
-              <w:t>(Please write supervisor remarks and evaluation notes here...)</w:t>
-            </w:r>
-            <w:r>
-              <w:rPr>
-                <w:i/>
-                <w:color w:val="64748B"/>
-              </w:rPr>
-              <w:br/>
-            </w:r>
-            <w:r>
-              <w:rPr>
-                <w:i/>
-                <w:color w:val="64748B"/>
-              </w:rPr>
-              <w:br/>
-            </w:r>
-            <w:r>
-              <w:rPr>
-                <w:i/>
-                <w:color w:val="64748B"/>
-              </w:rPr>
-              <w:br/>
-            </w:r>
-            <w:r>
-              <w:rPr>
-                <w:i/>
-                <w:color w:val="64748B"/>
-              </w:rPr>
-              <w:br/>
+              <w:t>Abdul Rehman has demonstrated exceptional initiative and technical competence during his first week by successfully scaffolding the full monorepo architecture and integrating a secure PostgreSQL database layer. His proactive approach to troubleshooting configuration issues independently while maintaining clean, error-free TypeScript code reflects high-quality engineering standards.</w:t>
             </w:r>
           </w:p>
         </w:tc>
@@ -1720,7 +1640,57 @@
           </w:tcPr>
           <w:p>
             <w:r>
-              <w:t>_________________________________________</w:t>
+              <w:rPr>
+                <w:noProof/>
+              </w:rPr>
+              <w:drawing>
+                <wp:inline distT="0" distB="0" distL="0" distR="0" wp14:anchorId="30FA9E94" wp14:editId="1C0DCBEF">
+                  <wp:extent cx="1322364" cy="837822"/>
+                  <wp:effectExtent l="0" t="0" r="0" b="635"/>
+                  <wp:docPr id="17" name="Picture 17"/>
+                  <wp:cNvGraphicFramePr>
+                    <a:graphicFrameLocks xmlns:a="http://schemas.openxmlformats.org/drawingml/2006/main" noChangeAspect="1"/>
+                  </wp:cNvGraphicFramePr>
+                  <a:graphic xmlns:a="http://schemas.openxmlformats.org/drawingml/2006/main">
+                    <a:graphicData uri="http://schemas.openxmlformats.org/drawingml/2006/picture">
+                      <pic:pic xmlns:pic="http://schemas.openxmlformats.org/drawingml/2006/picture">
+                        <pic:nvPicPr>
+                          <pic:cNvPr id="0" name="Picture 1"/>
+                          <pic:cNvPicPr>
+                            <a:picLocks noChangeAspect="1" noChangeArrowheads="1"/>
+                          </pic:cNvPicPr>
+                        </pic:nvPicPr>
+                        <pic:blipFill>
+                          <a:blip r:embed="rId22">
+                            <a:extLst>
+                              <a:ext uri="{28A0092B-C50C-407E-A947-70E740481C1C}">
+                                <a14:useLocalDpi xmlns:a14="http://schemas.microsoft.com/office/drawing/2010/main" val="0"/>
+                              </a:ext>
+                            </a:extLst>
+                          </a:blip>
+                          <a:srcRect/>
+                          <a:stretch>
+                            <a:fillRect/>
+                          </a:stretch>
+                        </pic:blipFill>
+                        <pic:spPr bwMode="auto">
+                          <a:xfrm>
+                            <a:off x="0" y="0"/>
+                            <a:ext cx="1370880" cy="868560"/>
+                          </a:xfrm>
+                          <a:prstGeom prst="rect">
+                            <a:avLst/>
+                          </a:prstGeom>
+                          <a:noFill/>
+                          <a:ln>
+                            <a:noFill/>
+                          </a:ln>
+                        </pic:spPr>
+                      </pic:pic>
+                    </a:graphicData>
+                  </a:graphic>
+                </wp:inline>
+              </w:drawing>
             </w:r>
             <w:r>
               <w:br/>
@@ -1752,7 +1722,13 @@
           </w:tcPr>
           <w:p>
             <w:r>
-              <w:t xml:space="preserve">Date: ______________, 2026  </w:t>
+              <w:t xml:space="preserve">Date: </w:t>
+            </w:r>
+            <w:r>
+              <w:t>July 31</w:t>
+            </w:r>
+            <w:r>
+              <w:t xml:space="preserve">, 2026  </w:t>
             </w:r>
           </w:p>
         </w:tc>

</xml_diff>